<commit_message>
All tests passing except tagged failure
</commit_message>
<xml_diff>
--- a/API Framework Write Up Info.docx
+++ b/API Framework Write Up Info.docx
@@ -2,6 +2,46 @@
 <file path=word/document.xml><?xml version="1.0" encoding="utf-8"?>
 <w:document xmlns:wpc="http://schemas.microsoft.com/office/word/2010/wordprocessingCanvas" xmlns:cx="http://schemas.microsoft.com/office/drawing/2014/chartex" xmlns:cx1="http://schemas.microsoft.com/office/drawing/2015/9/8/chartex" xmlns:cx2="http://schemas.microsoft.com/office/drawing/2015/10/21/chartex" xmlns:cx3="http://schemas.microsoft.com/office/drawing/2016/5/9/chartex" xmlns:cx4="http://schemas.microsoft.com/office/drawing/2016/5/10/chartex" xmlns:cx5="http://schemas.microsoft.com/office/drawing/2016/5/11/chartex" xmlns:cx6="http://schemas.microsoft.com/office/drawing/2016/5/12/chartex" xmlns:cx7="http://schemas.microsoft.com/office/drawing/2016/5/13/chartex" xmlns:cx8="http://schemas.microsoft.com/office/drawing/2016/5/14/chartex" xmlns:mc="http://schemas.openxmlformats.org/markup-compatibility/2006" xmlns:aink="http://schemas.microsoft.com/office/drawing/2016/ink" xmlns:am3d="http://schemas.microsoft.com/office/drawing/2017/model3d" xmlns:o="urn:schemas-microsoft-com:office:office" xmlns:oel="http://schemas.microsoft.com/office/2019/extlst" xmlns:r="http://schemas.openxmlformats.org/officeDocument/2006/relationships" xmlns:m="http://schemas.openxmlformats.org/officeDocument/2006/math" xmlns:v="urn:schemas-microsoft-com:vml" xmlns:wp14="http://schemas.microsoft.com/office/word/2010/wordprocessingDrawing" xmlns:wp="http://schemas.openxmlformats.org/drawingml/2006/wordprocessingDrawing" xmlns:w10="urn:schemas-microsoft-com:office:word" xmlns:w="http://schemas.openxmlformats.org/wordprocessingml/2006/main" xmlns:w14="http://schemas.microsoft.com/office/word/2010/wordml" xmlns:w15="http://schemas.microsoft.com/office/word/2012/wordml" xmlns:w16cex="http://schemas.microsoft.com/office/word/2018/wordml/cex" xmlns:w16cid="http://schemas.microsoft.com/office/word/2016/wordml/cid" xmlns:w16="http://schemas.microsoft.com/office/word/2018/wordml" xmlns:w16sdtdh="http://schemas.microsoft.com/office/word/2020/wordml/sdtdatahash" xmlns:w16se="http://schemas.microsoft.com/office/word/2015/wordml/symex" xmlns:wpg="http://schemas.microsoft.com/office/word/2010/wordprocessingGroup" xmlns:wpi="http://schemas.microsoft.com/office/word/2010/wordprocessingInk" xmlns:wne="http://schemas.microsoft.com/office/word/2006/wordml" xmlns:wps="http://schemas.microsoft.com/office/word/2010/wordprocessingShape" mc:Ignorable="w14 w15 w16se w16cid w16 w16cex w16sdtdh wp14">
   <w:body>
+    <w:p>
+      <w:r>
+        <w:drawing>
+          <wp:inline distT="0" distB="0" distL="0" distR="0" wp14:anchorId="497610F1" wp14:editId="49291A74">
+            <wp:extent cx="5731510" cy="3091815"/>
+            <wp:effectExtent l="0" t="0" r="2540" b="0"/>
+            <wp:docPr id="770134450" name="Picture 1" descr="A computer screen with many colorful text&#10;&#10;Description automatically generated"/>
+            <wp:cNvGraphicFramePr>
+              <a:graphicFrameLocks xmlns:a="http://schemas.openxmlformats.org/drawingml/2006/main" noChangeAspect="1"/>
+            </wp:cNvGraphicFramePr>
+            <a:graphic xmlns:a="http://schemas.openxmlformats.org/drawingml/2006/main">
+              <a:graphicData uri="http://schemas.openxmlformats.org/drawingml/2006/picture">
+                <pic:pic xmlns:pic="http://schemas.openxmlformats.org/drawingml/2006/picture">
+                  <pic:nvPicPr>
+                    <pic:cNvPr id="770134450" name="Picture 1" descr="A computer screen with many colorful text&#10;&#10;Description automatically generated"/>
+                    <pic:cNvPicPr/>
+                  </pic:nvPicPr>
+                  <pic:blipFill>
+                    <a:blip r:embed="rId6"/>
+                    <a:stretch>
+                      <a:fillRect/>
+                    </a:stretch>
+                  </pic:blipFill>
+                  <pic:spPr>
+                    <a:xfrm>
+                      <a:off x="0" y="0"/>
+                      <a:ext cx="5731510" cy="3091815"/>
+                    </a:xfrm>
+                    <a:prstGeom prst="rect">
+                      <a:avLst/>
+                    </a:prstGeom>
+                  </pic:spPr>
+                </pic:pic>
+              </a:graphicData>
+            </a:graphic>
+          </wp:inline>
+        </w:drawing>
+      </w:r>
+    </w:p>
+    <w:p/>
     <w:p>
       <w:r>
         <w:t xml:space="preserve">Cloned the repository. Used the README to get it up and running. When running I can go to this: </w:t>
@@ -28,7 +68,7 @@
                     <pic:cNvPicPr/>
                   </pic:nvPicPr>
                   <pic:blipFill>
-                    <a:blip r:embed="rId6"/>
+                    <a:blip r:embed="rId7"/>
                     <a:stretch>
                       <a:fillRect/>
                     </a:stretch>
@@ -51,6 +91,7 @@
     </w:p>
     <w:p>
       <w:r>
+        <w:lastRenderedPageBreak/>
         <w:t>To see all this info:</w:t>
       </w:r>
       <w:r>
@@ -76,7 +117,7 @@
                     <pic:cNvPicPr/>
                   </pic:nvPicPr>
                   <pic:blipFill>
-                    <a:blip r:embed="rId7"/>
+                    <a:blip r:embed="rId8"/>
                     <a:stretch>
                       <a:fillRect/>
                     </a:stretch>
@@ -124,7 +165,7 @@
                     <pic:cNvPicPr/>
                   </pic:nvPicPr>
                   <pic:blipFill>
-                    <a:blip r:embed="rId8"/>
+                    <a:blip r:embed="rId9"/>
                     <a:stretch>
                       <a:fillRect/>
                     </a:stretch>
@@ -147,7 +188,6 @@
     </w:p>
     <w:p>
       <w:r>
-        <w:lastRenderedPageBreak/>
         <w:t>Played around in Postman to retrieve all the pizzas</w:t>
       </w:r>
       <w:r>
@@ -192,7 +232,7 @@
                     <pic:cNvPicPr/>
                   </pic:nvPicPr>
                   <pic:blipFill>
-                    <a:blip r:embed="rId9"/>
+                    <a:blip r:embed="rId10"/>
                     <a:stretch>
                       <a:fillRect/>
                     </a:stretch>
@@ -245,7 +285,7 @@
                     <pic:cNvPicPr/>
                   </pic:nvPicPr>
                   <pic:blipFill>
-                    <a:blip r:embed="rId10"/>
+                    <a:blip r:embed="rId11"/>
                     <a:stretch>
                       <a:fillRect/>
                     </a:stretch>
@@ -270,7 +310,7 @@
       <w:r>
         <w:t xml:space="preserve">Watched this video: </w:t>
       </w:r>
-      <w:hyperlink r:id="rId11" w:history="1">
+      <w:hyperlink r:id="rId12" w:history="1">
         <w:proofErr w:type="spellStart"/>
         <w:r>
           <w:rPr>
@@ -350,6 +390,7 @@
     </w:p>
     <w:p>
       <w:r>
+        <w:lastRenderedPageBreak/>
         <w:t>Creat</w:t>
       </w:r>
       <w:r>
@@ -589,11 +630,7 @@
     </w:p>
     <w:p>
       <w:r>
-        <w:t xml:space="preserve">Overall, this test method verifies that the API endpoint responsible for retrieving pizzas returns a valid response with the expected structure and content. It checks for the presence of the response object, ensures that it contains the correct number of pizza objects, and validates that each pizza </w:t>
-      </w:r>
-      <w:r>
-        <w:lastRenderedPageBreak/>
-        <w:t xml:space="preserve">object has a non-null and non-empty </w:t>
+        <w:t xml:space="preserve">Overall, this test method verifies that the API endpoint responsible for retrieving pizzas returns a valid response with the expected structure and content. It checks for the presence of the response object, ensures that it contains the correct number of pizza objects, and validates that each pizza object has a non-null and non-empty </w:t>
       </w:r>
       <w:proofErr w:type="spellStart"/>
       <w:r>
@@ -749,6 +786,7 @@
         </w:numPr>
       </w:pPr>
       <w:r>
+        <w:lastRenderedPageBreak/>
         <w:t>Ensure the base URL is ready: Before doing anything, make sure we have the main address where our API lives.</w:t>
       </w:r>
     </w:p>
@@ -923,7 +961,6 @@
         </w:numPr>
       </w:pPr>
       <w:r>
-        <w:lastRenderedPageBreak/>
         <w:t xml:space="preserve">Make the call: We use the </w:t>
       </w:r>
       <w:proofErr w:type="spellStart"/>
@@ -1051,6 +1088,7 @@
         </w:rPr>
       </w:pPr>
       <w:r>
+        <w:lastRenderedPageBreak/>
         <w:t>```</w:t>
       </w:r>
       <w:r>
@@ -1358,7 +1396,6 @@
         </w:numPr>
       </w:pPr>
       <w:r>
-        <w:lastRenderedPageBreak/>
         <w:t xml:space="preserve">Creating a new pizza object: A new </w:t>
       </w:r>
       <w:proofErr w:type="spellStart"/>
@@ -1566,6 +1603,7 @@
         </w:numPr>
       </w:pPr>
       <w:r>
+        <w:lastRenderedPageBreak/>
         <w:t>Creating a new pizza: We start by making a pizza with all its details, like its name, size, and toppings. We give this pizza an ID of "4".</w:t>
       </w:r>
     </w:p>
@@ -1640,7 +1678,7 @@
       <w:r>
         <w:t xml:space="preserve">: </w:t>
       </w:r>
-      <w:hyperlink r:id="rId12" w:history="1">
+      <w:hyperlink r:id="rId13" w:history="1">
         <w:r>
           <w:rPr>
             <w:rStyle w:val="Hyperlink"/>
@@ -1694,7 +1732,6 @@
         </w:numPr>
       </w:pPr>
       <w:r>
-        <w:lastRenderedPageBreak/>
         <w:t>Sending the updated pizza to the server: It creates a request to update the pizza on the server using the PUT method, which is typically used to update existing resources. It attaches the updated pizza details to the request body as JSON.</w:t>
       </w:r>
     </w:p>
@@ -1869,6 +1906,7 @@
         </w:numPr>
       </w:pPr>
       <w:r>
+        <w:lastRenderedPageBreak/>
         <w:t xml:space="preserve">pizza =&gt; </w:t>
       </w:r>
       <w:proofErr w:type="spellStart"/>
@@ -2156,7 +2194,6 @@
         </w:numPr>
       </w:pPr>
       <w:r>
-        <w:lastRenderedPageBreak/>
         <w:t xml:space="preserve">Send DELETE Request: Executes the DELETE request using the </w:t>
       </w:r>
       <w:proofErr w:type="spellStart"/>
@@ -2262,6 +2299,7 @@
     </w:p>
     <w:p>
       <w:r>
+        <w:lastRenderedPageBreak/>
         <w:t>Asserts that the count of pizzas in the response is equal to 3, indicating that the API returned the expected number of pizzas.</w:t>
       </w:r>
     </w:p>
@@ -2400,7 +2438,6 @@
         </w:numPr>
       </w:pPr>
       <w:r>
-        <w:lastRenderedPageBreak/>
         <w:t>The toppings of the newly added pizza. It ensures that the toppings list is not null and not empty, and checks if the name of the first topping is "Beef".</w:t>
       </w:r>
     </w:p>
@@ -2814,7 +2851,6 @@
       <w:proofErr w:type="spellStart"/>
       <w:proofErr w:type="gramStart"/>
       <w:r>
-        <w:lastRenderedPageBreak/>
         <w:t>DeletePizzaFromAPI</w:t>
       </w:r>
       <w:proofErr w:type="spellEnd"/>
@@ -2994,6 +3030,7 @@
     </w:p>
     <w:p>
       <w:r>
+        <w:lastRenderedPageBreak/>
         <w:t>This test method is designed to intentionally fail, serving as a validation for certain error-handling scenarios. Here's a breakdown:</w:t>
       </w:r>
     </w:p>
@@ -3075,7 +3112,7 @@
       </w:r>
     </w:p>
     <w:p>
-      <w:hyperlink r:id="rId13" w:history="1">
+      <w:hyperlink r:id="rId14" w:history="1">
         <w:r>
           <w:rPr>
             <w:rStyle w:val="Hyperlink"/>
@@ -3105,7 +3142,7 @@
                     <pic:cNvPicPr/>
                   </pic:nvPicPr>
                   <pic:blipFill>
-                    <a:blip r:embed="rId14"/>
+                    <a:blip r:embed="rId15"/>
                     <a:stretch>
                       <a:fillRect/>
                     </a:stretch>
@@ -3127,6 +3164,806 @@
       </w:r>
     </w:p>
     <w:p/>
+    <w:p>
+      <w:hyperlink r:id="rId16" w:history="1">
+        <w:r>
+          <w:rPr>
+            <w:rStyle w:val="Hyperlink"/>
+          </w:rPr>
+          <w:t>https://medium.com/@preethy.bhaskar/creating-a-api-automation-framework-using-restsharp-and-specflow-5fefe353b5a7</w:t>
+        </w:r>
+      </w:hyperlink>
+    </w:p>
+    <w:p>
+      <w:hyperlink r:id="rId17" w:history="1">
+        <w:r>
+          <w:rPr>
+            <w:rStyle w:val="Hyperlink"/>
+          </w:rPr>
+          <w:t>https://www.youtube.com/watch?v=hWzRRgRAy64&amp;list=PL_GzuQ9GmG0GN0iw8qW-bP6kDy48BBk6S&amp;index=18</w:t>
+        </w:r>
+      </w:hyperlink>
+    </w:p>
+    <w:p>
+      <w:hyperlink r:id="rId18" w:history="1">
+        <w:r>
+          <w:rPr>
+            <w:rStyle w:val="Hyperlink"/>
+          </w:rPr>
+          <w:t>https://www.youtube.com/watch?v=ANt5bOWiZE4&amp;list=PLlsKgYi2Lw73ox9LF5VfYMrA1eo9e7rIq&amp;index=16</w:t>
+        </w:r>
+      </w:hyperlink>
+    </w:p>
+    <w:p>
+      <w:hyperlink r:id="rId19" w:history="1">
+        <w:r>
+          <w:rPr>
+            <w:rStyle w:val="Hyperlink"/>
+          </w:rPr>
+          <w:t>https://medium.com/maestral-solutions/building-api-automation-testing-framework-the-page-object-modelling-way-afd35e21b6f6</w:t>
+        </w:r>
+      </w:hyperlink>
+    </w:p>
+    <w:p>
+      <w:r>
+        <w:rPr>
+          <w:noProof/>
+        </w:rPr>
+        <w:lastRenderedPageBreak/>
+        <w:drawing>
+          <wp:inline distT="0" distB="0" distL="0" distR="0" wp14:anchorId="5997A0AB" wp14:editId="6F088274">
+            <wp:extent cx="5731510" cy="2678430"/>
+            <wp:effectExtent l="0" t="0" r="2540" b="7620"/>
+            <wp:docPr id="16112916" name="Picture 1" descr="A screenshot of a computer&#10;&#10;Description automatically generated"/>
+            <wp:cNvGraphicFramePr>
+              <a:graphicFrameLocks xmlns:a="http://schemas.openxmlformats.org/drawingml/2006/main" noChangeAspect="1"/>
+            </wp:cNvGraphicFramePr>
+            <a:graphic xmlns:a="http://schemas.openxmlformats.org/drawingml/2006/main">
+              <a:graphicData uri="http://schemas.openxmlformats.org/drawingml/2006/picture">
+                <pic:pic xmlns:pic="http://schemas.openxmlformats.org/drawingml/2006/picture">
+                  <pic:nvPicPr>
+                    <pic:cNvPr id="16112916" name="Picture 1" descr="A screenshot of a computer&#10;&#10;Description automatically generated"/>
+                    <pic:cNvPicPr/>
+                  </pic:nvPicPr>
+                  <pic:blipFill>
+                    <a:blip r:embed="rId20"/>
+                    <a:stretch>
+                      <a:fillRect/>
+                    </a:stretch>
+                  </pic:blipFill>
+                  <pic:spPr>
+                    <a:xfrm>
+                      <a:off x="0" y="0"/>
+                      <a:ext cx="5731510" cy="2678430"/>
+                    </a:xfrm>
+                    <a:prstGeom prst="rect">
+                      <a:avLst/>
+                    </a:prstGeom>
+                  </pic:spPr>
+                </pic:pic>
+              </a:graphicData>
+            </a:graphic>
+          </wp:inline>
+        </w:drawing>
+      </w:r>
+    </w:p>
+    <w:p>
+      <w:hyperlink r:id="rId21" w:history="1">
+        <w:r>
+          <w:rPr>
+            <w:rStyle w:val="Hyperlink"/>
+          </w:rPr>
+          <w:t>https://stackoverflow.com/questions/36848655/waiting-on-task-in-nunit-test-method</w:t>
+        </w:r>
+      </w:hyperlink>
+    </w:p>
+    <w:p>
+      <w:hyperlink r:id="rId22" w:history="1">
+        <w:r>
+          <w:rPr>
+            <w:rStyle w:val="Hyperlink"/>
+          </w:rPr>
+          <w:t>https://www.youtube.com/results?search_query=ising+firstordefailt+nunit</w:t>
+        </w:r>
+      </w:hyperlink>
+    </w:p>
+    <w:p>
+      <w:hyperlink r:id="rId23" w:anchor="making-a-call" w:history="1">
+        <w:r>
+          <w:rPr>
+            <w:rStyle w:val="Hyperlink"/>
+          </w:rPr>
+          <w:t>https://restsharp.dev/usage#making-a-call</w:t>
+        </w:r>
+      </w:hyperlink>
+    </w:p>
+    <w:p>
+      <w:hyperlink r:id="rId24" w:history="1">
+        <w:r>
+          <w:rPr>
+            <w:rStyle w:val="Hyperlink"/>
+          </w:rPr>
+          <w:t>https://dev.to/m4rri4nne/nunit-and-c-tutorial-to-automate-your-api-tests-from-scratch-24nf</w:t>
+        </w:r>
+      </w:hyperlink>
+    </w:p>
+    <w:p>
+      <w:hyperlink r:id="rId25" w:history="1">
+        <w:r>
+          <w:rPr>
+            <w:rStyle w:val="Hyperlink"/>
+          </w:rPr>
+          <w:t>https://learn.microsoft.com/en-us/dotnet/api/system.linq.enumerable.firstordefault?view=net-8.0</w:t>
+        </w:r>
+      </w:hyperlink>
+    </w:p>
+    <w:p>
+      <w:r>
+        <w:rPr>
+          <w:noProof/>
+        </w:rPr>
+        <w:drawing>
+          <wp:inline distT="0" distB="0" distL="0" distR="0" wp14:anchorId="162D7268" wp14:editId="1067C3C8">
+            <wp:extent cx="5731510" cy="1509395"/>
+            <wp:effectExtent l="0" t="0" r="2540" b="0"/>
+            <wp:docPr id="1720954153" name="Picture 1" descr="A screenshot of a computer program&#10;&#10;Description automatically generated"/>
+            <wp:cNvGraphicFramePr>
+              <a:graphicFrameLocks xmlns:a="http://schemas.openxmlformats.org/drawingml/2006/main" noChangeAspect="1"/>
+            </wp:cNvGraphicFramePr>
+            <a:graphic xmlns:a="http://schemas.openxmlformats.org/drawingml/2006/main">
+              <a:graphicData uri="http://schemas.openxmlformats.org/drawingml/2006/picture">
+                <pic:pic xmlns:pic="http://schemas.openxmlformats.org/drawingml/2006/picture">
+                  <pic:nvPicPr>
+                    <pic:cNvPr id="1720954153" name="Picture 1" descr="A screenshot of a computer program&#10;&#10;Description automatically generated"/>
+                    <pic:cNvPicPr/>
+                  </pic:nvPicPr>
+                  <pic:blipFill>
+                    <a:blip r:embed="rId26"/>
+                    <a:stretch>
+                      <a:fillRect/>
+                    </a:stretch>
+                  </pic:blipFill>
+                  <pic:spPr>
+                    <a:xfrm>
+                      <a:off x="0" y="0"/>
+                      <a:ext cx="5731510" cy="1509395"/>
+                    </a:xfrm>
+                    <a:prstGeom prst="rect">
+                      <a:avLst/>
+                    </a:prstGeom>
+                  </pic:spPr>
+                </pic:pic>
+              </a:graphicData>
+            </a:graphic>
+          </wp:inline>
+        </w:drawing>
+      </w:r>
+    </w:p>
+    <w:p>
+      <w:hyperlink r:id="rId27" w:anchor="simple-factory" w:history="1">
+        <w:r>
+          <w:rPr>
+            <w:rStyle w:val="Hyperlink"/>
+          </w:rPr>
+          <w:t>https://restsharp.dev/usage#simple-factory</w:t>
+        </w:r>
+      </w:hyperlink>
+    </w:p>
+    <w:p>
+      <w:hyperlink r:id="rId28" w:history="1">
+        <w:r>
+          <w:rPr>
+            <w:rStyle w:val="Hyperlink"/>
+          </w:rPr>
+          <w:t>https://stackoverflow.com/questions/30765850/restsharp-how-do-i-get-the-numerical-http-response-code</w:t>
+        </w:r>
+      </w:hyperlink>
+    </w:p>
+    <w:p>
+      <w:r>
+        <w:rPr>
+          <w:noProof/>
+        </w:rPr>
+        <w:drawing>
+          <wp:inline distT="0" distB="0" distL="0" distR="0" wp14:anchorId="14EE3BA1" wp14:editId="74D4D51D">
+            <wp:extent cx="5731510" cy="1462405"/>
+            <wp:effectExtent l="0" t="0" r="2540" b="4445"/>
+            <wp:docPr id="1667066280" name="Picture 1" descr="A black background with white text&#10;&#10;Description automatically generated"/>
+            <wp:cNvGraphicFramePr>
+              <a:graphicFrameLocks xmlns:a="http://schemas.openxmlformats.org/drawingml/2006/main" noChangeAspect="1"/>
+            </wp:cNvGraphicFramePr>
+            <a:graphic xmlns:a="http://schemas.openxmlformats.org/drawingml/2006/main">
+              <a:graphicData uri="http://schemas.openxmlformats.org/drawingml/2006/picture">
+                <pic:pic xmlns:pic="http://schemas.openxmlformats.org/drawingml/2006/picture">
+                  <pic:nvPicPr>
+                    <pic:cNvPr id="1667066280" name="Picture 1" descr="A black background with white text&#10;&#10;Description automatically generated"/>
+                    <pic:cNvPicPr/>
+                  </pic:nvPicPr>
+                  <pic:blipFill>
+                    <a:blip r:embed="rId29"/>
+                    <a:stretch>
+                      <a:fillRect/>
+                    </a:stretch>
+                  </pic:blipFill>
+                  <pic:spPr>
+                    <a:xfrm>
+                      <a:off x="0" y="0"/>
+                      <a:ext cx="5731510" cy="1462405"/>
+                    </a:xfrm>
+                    <a:prstGeom prst="rect">
+                      <a:avLst/>
+                    </a:prstGeom>
+                  </pic:spPr>
+                </pic:pic>
+              </a:graphicData>
+            </a:graphic>
+          </wp:inline>
+        </w:drawing>
+      </w:r>
+    </w:p>
+    <w:p>
+      <w:hyperlink r:id="rId30" w:history="1">
+        <w:r>
+          <w:rPr>
+            <w:rStyle w:val="Hyperlink"/>
+          </w:rPr>
+          <w:t>https://www.reddit.com/r/csharp/comments/oxaoj4/c_why_use_async_if_i_must_await_for_the_response/</w:t>
+        </w:r>
+      </w:hyperlink>
+    </w:p>
+    <w:p>
+      <w:hyperlink r:id="rId31" w:history="1">
+        <w:r>
+          <w:rPr>
+            <w:rStyle w:val="Hyperlink"/>
+          </w:rPr>
+          <w:t>https://learn.microsoft.com/en-us/dotnet/csharp/asynchronous-programming/async-scenarios</w:t>
+        </w:r>
+      </w:hyperlink>
+    </w:p>
+    <w:p>
+      <w:hyperlink r:id="rId32" w:history="1">
+        <w:r>
+          <w:rPr>
+            <w:rStyle w:val="Hyperlink"/>
+          </w:rPr>
+          <w:t>https://learn.microsoft.com/en-us/dotnet/api/system.threading.tasks.task.delay?view=net-8.0</w:t>
+        </w:r>
+      </w:hyperlink>
+    </w:p>
+    <w:p>
+      <w:hyperlink r:id="rId33" w:history="1">
+        <w:r>
+          <w:rPr>
+            <w:rStyle w:val="Hyperlink"/>
+          </w:rPr>
+          <w:t>https://learn.microsoft.com/en-us/dotnet/core/testing/order-unit-tests?pivots=nunit</w:t>
+        </w:r>
+      </w:hyperlink>
+    </w:p>
+    <w:p>
+      <w:hyperlink r:id="rId34" w:history="1">
+        <w:r>
+          <w:rPr>
+            <w:rStyle w:val="Hyperlink"/>
+          </w:rPr>
+          <w:t>https://learn.microsoft.com/en-us/dotnet/csharp/asynchronous-programming/</w:t>
+        </w:r>
+      </w:hyperlink>
+    </w:p>
+    <w:p>
+      <w:hyperlink r:id="rId35" w:history="1">
+        <w:r>
+          <w:rPr>
+            <w:rStyle w:val="Hyperlink"/>
+          </w:rPr>
+          <w:t>https://docs.nunit.org/articles/nunit/writing-tests/attributes/setupfixture.html</w:t>
+        </w:r>
+      </w:hyperlink>
+    </w:p>
+    <w:p>
+      <w:hyperlink r:id="rId36" w:history="1">
+        <w:r>
+          <w:rPr>
+            <w:rStyle w:val="Hyperlink"/>
+          </w:rPr>
+          <w:t>https://docs.nunit.org/articles/nunit/technical-notes/usage/SetUp-and-TearDown.html</w:t>
+        </w:r>
+      </w:hyperlink>
+    </w:p>
+    <w:p>
+      <w:hyperlink r:id="rId37" w:anchor="system-diagnostics-process-start(system-string)" w:history="1">
+        <w:r>
+          <w:rPr>
+            <w:rStyle w:val="Hyperlink"/>
+          </w:rPr>
+          <w:t>https://learn.microsoft.com/en-us/dotnet/api/system.diagnostics.process.start?view=net-8.0#system-diagnostics-process-start(system-string)</w:t>
+        </w:r>
+      </w:hyperlink>
+    </w:p>
+    <w:p>
+      <w:hyperlink r:id="rId38" w:history="1">
+        <w:r>
+          <w:rPr>
+            <w:rStyle w:val="Hyperlink"/>
+          </w:rPr>
+          <w:t>https://learn.microsoft.com/en-us/dotnet/csharp/asynchronous-programming/</w:t>
+        </w:r>
+      </w:hyperlink>
+    </w:p>
+    <w:p/>
+    <w:p>
+      <w:r>
+        <w:t>EDGE</w:t>
+      </w:r>
+    </w:p>
+    <w:p>
+      <w:hyperlink r:id="rId39" w:anchor="api-pizza-updatepizza" w:history="1">
+        <w:r>
+          <w:rPr>
+            <w:rStyle w:val="Hyperlink"/>
+          </w:rPr>
+          <w:t>Mock Pizza Menu Service Endpoint</w:t>
+        </w:r>
+      </w:hyperlink>
+    </w:p>
+    <w:p>
+      <w:hyperlink r:id="rId40" w:history="1">
+        <w:r>
+          <w:rPr>
+            <w:rStyle w:val="Hyperlink"/>
+          </w:rPr>
+          <w:t>localhost:8080/pizzas</w:t>
+        </w:r>
+      </w:hyperlink>
+    </w:p>
+    <w:p>
+      <w:hyperlink r:id="rId41" w:anchor="getting-started" w:history="1">
+        <w:r>
+          <w:rPr>
+            <w:rStyle w:val="Hyperlink"/>
+          </w:rPr>
+          <w:t xml:space="preserve">Quick start | </w:t>
+        </w:r>
+        <w:proofErr w:type="spellStart"/>
+        <w:r>
+          <w:rPr>
+            <w:rStyle w:val="Hyperlink"/>
+          </w:rPr>
+          <w:t>RestSharp</w:t>
+        </w:r>
+        <w:proofErr w:type="spellEnd"/>
+      </w:hyperlink>
+    </w:p>
+    <w:p>
+      <w:hyperlink r:id="rId42" w:history="1">
+        <w:r>
+          <w:rPr>
+            <w:rStyle w:val="Hyperlink"/>
+          </w:rPr>
+          <w:t xml:space="preserve">Creating an </w:t>
+        </w:r>
+        <w:proofErr w:type="spellStart"/>
+        <w:r>
+          <w:rPr>
+            <w:rStyle w:val="Hyperlink"/>
+          </w:rPr>
+          <w:t>api</w:t>
+        </w:r>
+        <w:proofErr w:type="spellEnd"/>
+        <w:r>
+          <w:rPr>
+            <w:rStyle w:val="Hyperlink"/>
+          </w:rPr>
+          <w:t xml:space="preserve"> automation framework using </w:t>
+        </w:r>
+        <w:proofErr w:type="spellStart"/>
+        <w:r>
+          <w:rPr>
+            <w:rStyle w:val="Hyperlink"/>
+          </w:rPr>
+          <w:t>RestSharp</w:t>
+        </w:r>
+        <w:proofErr w:type="spellEnd"/>
+        <w:r>
+          <w:rPr>
+            <w:rStyle w:val="Hyperlink"/>
+          </w:rPr>
+          <w:t xml:space="preserve"> and </w:t>
+        </w:r>
+        <w:proofErr w:type="spellStart"/>
+        <w:r>
+          <w:rPr>
+            <w:rStyle w:val="Hyperlink"/>
+          </w:rPr>
+          <w:t>Specflow</w:t>
+        </w:r>
+        <w:proofErr w:type="spellEnd"/>
+        <w:r>
+          <w:rPr>
+            <w:rStyle w:val="Hyperlink"/>
+          </w:rPr>
+          <w:t xml:space="preserve"> | by </w:t>
+        </w:r>
+        <w:proofErr w:type="spellStart"/>
+        <w:r>
+          <w:rPr>
+            <w:rStyle w:val="Hyperlink"/>
+          </w:rPr>
+          <w:t>Preethy</w:t>
+        </w:r>
+        <w:proofErr w:type="spellEnd"/>
+        <w:r>
+          <w:rPr>
+            <w:rStyle w:val="Hyperlink"/>
+          </w:rPr>
+          <w:t xml:space="preserve"> Bhaskar | Medium</w:t>
+        </w:r>
+      </w:hyperlink>
+    </w:p>
+    <w:p>
+      <w:hyperlink r:id="rId43" w:history="1">
+        <w:r>
+          <w:rPr>
+            <w:rStyle w:val="Hyperlink"/>
+          </w:rPr>
+          <w:t xml:space="preserve">C# Tutorial - Serializing and Deserializing JSON with </w:t>
+        </w:r>
+        <w:proofErr w:type="spellStart"/>
+        <w:r>
+          <w:rPr>
+            <w:rStyle w:val="Hyperlink"/>
+          </w:rPr>
+          <w:t>NewtonSoft</w:t>
+        </w:r>
+        <w:proofErr w:type="spellEnd"/>
+        <w:r>
+          <w:rPr>
+            <w:rStyle w:val="Hyperlink"/>
+          </w:rPr>
+          <w:t xml:space="preserve"> (JSON.NET) (youtube.com)</w:t>
+        </w:r>
+      </w:hyperlink>
+    </w:p>
+    <w:p>
+      <w:hyperlink r:id="rId44" w:history="1">
+        <w:proofErr w:type="spellStart"/>
+        <w:r>
+          <w:rPr>
+            <w:rStyle w:val="Hyperlink"/>
+          </w:rPr>
+          <w:t>RestSharp</w:t>
+        </w:r>
+        <w:proofErr w:type="spellEnd"/>
+        <w:r>
+          <w:rPr>
+            <w:rStyle w:val="Hyperlink"/>
+          </w:rPr>
+          <w:t xml:space="preserve"> v108: REST APIs Testing using C# </w:t>
+        </w:r>
+        <w:proofErr w:type="spellStart"/>
+        <w:r>
+          <w:rPr>
+            <w:rStyle w:val="Hyperlink"/>
+          </w:rPr>
+          <w:t>RestSharp</w:t>
+        </w:r>
+        <w:proofErr w:type="spellEnd"/>
+        <w:r>
+          <w:rPr>
+            <w:rStyle w:val="Hyperlink"/>
+          </w:rPr>
+          <w:t xml:space="preserve"> and .Net Core - Part 1 - YouTube</w:t>
+        </w:r>
+      </w:hyperlink>
+    </w:p>
+    <w:p>
+      <w:hyperlink r:id="rId45" w:history="1">
+        <w:proofErr w:type="spellStart"/>
+        <w:r>
+          <w:rPr>
+            <w:rStyle w:val="Hyperlink"/>
+          </w:rPr>
+          <w:t>RestSharp</w:t>
+        </w:r>
+        <w:proofErr w:type="spellEnd"/>
+        <w:r>
+          <w:rPr>
+            <w:rStyle w:val="Hyperlink"/>
+          </w:rPr>
+          <w:t xml:space="preserve">: REST APIs Testing using C# </w:t>
+        </w:r>
+        <w:proofErr w:type="spellStart"/>
+        <w:r>
+          <w:rPr>
+            <w:rStyle w:val="Hyperlink"/>
+          </w:rPr>
+          <w:t>RestSharp</w:t>
+        </w:r>
+        <w:proofErr w:type="spellEnd"/>
+        <w:r>
+          <w:rPr>
+            <w:rStyle w:val="Hyperlink"/>
+          </w:rPr>
+          <w:t xml:space="preserve"> and Json.Net - Part 1 | Getting started - YouTube</w:t>
+        </w:r>
+      </w:hyperlink>
+    </w:p>
+    <w:p>
+      <w:hyperlink r:id="rId46" w:history="1">
+        <w:r>
+          <w:rPr>
+            <w:rStyle w:val="Hyperlink"/>
+          </w:rPr>
+          <w:t xml:space="preserve">Unit testing C# with </w:t>
+        </w:r>
+        <w:proofErr w:type="spellStart"/>
+        <w:r>
+          <w:rPr>
+            <w:rStyle w:val="Hyperlink"/>
+          </w:rPr>
+          <w:t>NUnit</w:t>
+        </w:r>
+        <w:proofErr w:type="spellEnd"/>
+        <w:r>
+          <w:rPr>
+            <w:rStyle w:val="Hyperlink"/>
+          </w:rPr>
+          <w:t xml:space="preserve"> and .NET Core - .NET | Microsoft Learn</w:t>
+        </w:r>
+      </w:hyperlink>
+    </w:p>
+    <w:p>
+      <w:r>
+        <w:rPr>
+          <w:noProof/>
+        </w:rPr>
+        <w:drawing>
+          <wp:inline distT="0" distB="0" distL="0" distR="0" wp14:anchorId="6BEC8004" wp14:editId="1EB7282E">
+            <wp:extent cx="5731510" cy="2995295"/>
+            <wp:effectExtent l="0" t="0" r="2540" b="0"/>
+            <wp:docPr id="1002737652" name="Picture 1" descr="A screenshot of a computer&#10;&#10;Description automatically generated"/>
+            <wp:cNvGraphicFramePr>
+              <a:graphicFrameLocks xmlns:a="http://schemas.openxmlformats.org/drawingml/2006/main" noChangeAspect="1"/>
+            </wp:cNvGraphicFramePr>
+            <a:graphic xmlns:a="http://schemas.openxmlformats.org/drawingml/2006/main">
+              <a:graphicData uri="http://schemas.openxmlformats.org/drawingml/2006/picture">
+                <pic:pic xmlns:pic="http://schemas.openxmlformats.org/drawingml/2006/picture">
+                  <pic:nvPicPr>
+                    <pic:cNvPr id="1002737652" name="Picture 1" descr="A screenshot of a computer&#10;&#10;Description automatically generated"/>
+                    <pic:cNvPicPr/>
+                  </pic:nvPicPr>
+                  <pic:blipFill>
+                    <a:blip r:embed="rId47"/>
+                    <a:stretch>
+                      <a:fillRect/>
+                    </a:stretch>
+                  </pic:blipFill>
+                  <pic:spPr>
+                    <a:xfrm>
+                      <a:off x="0" y="0"/>
+                      <a:ext cx="5731510" cy="2995295"/>
+                    </a:xfrm>
+                    <a:prstGeom prst="rect">
+                      <a:avLst/>
+                    </a:prstGeom>
+                  </pic:spPr>
+                </pic:pic>
+              </a:graphicData>
+            </a:graphic>
+          </wp:inline>
+        </w:drawing>
+      </w:r>
+    </w:p>
+    <w:p>
+      <w:hyperlink r:id="rId48" w:history="1">
+        <w:r>
+          <w:rPr>
+            <w:rStyle w:val="Hyperlink"/>
+          </w:rPr>
+          <w:t xml:space="preserve">Part 1. Getting Started - </w:t>
+        </w:r>
+        <w:proofErr w:type="spellStart"/>
+        <w:r>
+          <w:rPr>
+            <w:rStyle w:val="Hyperlink"/>
+          </w:rPr>
+          <w:t>TestifyQA</w:t>
+        </w:r>
+        <w:proofErr w:type="spellEnd"/>
+      </w:hyperlink>
+    </w:p>
+    <w:p>
+      <w:hyperlink r:id="rId49" w:history="1">
+        <w:r>
+          <w:rPr>
+            <w:rStyle w:val="Hyperlink"/>
+          </w:rPr>
+          <w:t xml:space="preserve">Building API Automation Testing Framework, The Page Object </w:t>
+        </w:r>
+        <w:proofErr w:type="spellStart"/>
+        <w:r>
+          <w:rPr>
+            <w:rStyle w:val="Hyperlink"/>
+          </w:rPr>
+          <w:t>Modeling</w:t>
+        </w:r>
+        <w:proofErr w:type="spellEnd"/>
+        <w:r>
+          <w:rPr>
+            <w:rStyle w:val="Hyperlink"/>
+          </w:rPr>
+          <w:t xml:space="preserve"> Way | by Enes Kuhn | </w:t>
+        </w:r>
+        <w:proofErr w:type="spellStart"/>
+        <w:r>
+          <w:rPr>
+            <w:rStyle w:val="Hyperlink"/>
+          </w:rPr>
+          <w:t>Maestral</w:t>
+        </w:r>
+        <w:proofErr w:type="spellEnd"/>
+        <w:r>
+          <w:rPr>
+            <w:rStyle w:val="Hyperlink"/>
+          </w:rPr>
+          <w:t>, an HTEC Group Company | Medium</w:t>
+        </w:r>
+      </w:hyperlink>
+    </w:p>
+    <w:p>
+      <w:hyperlink r:id="rId50" w:history="1">
+        <w:proofErr w:type="spellStart"/>
+        <w:r>
+          <w:rPr>
+            <w:rStyle w:val="Hyperlink"/>
+          </w:rPr>
+          <w:t>c#</w:t>
+        </w:r>
+        <w:proofErr w:type="spellEnd"/>
+        <w:r>
+          <w:rPr>
+            <w:rStyle w:val="Hyperlink"/>
+          </w:rPr>
+          <w:t xml:space="preserve"> - </w:t>
+        </w:r>
+        <w:proofErr w:type="spellStart"/>
+        <w:r>
+          <w:rPr>
+            <w:rStyle w:val="Hyperlink"/>
+          </w:rPr>
+          <w:t>RestSharp</w:t>
+        </w:r>
+        <w:proofErr w:type="spellEnd"/>
+        <w:r>
+          <w:rPr>
+            <w:rStyle w:val="Hyperlink"/>
+          </w:rPr>
+          <w:t xml:space="preserve"> - How do I get the numerical http response code? - Stack Overflow</w:t>
+        </w:r>
+      </w:hyperlink>
+    </w:p>
+    <w:p>
+      <w:hyperlink r:id="rId51" w:history="1">
+        <w:proofErr w:type="spellStart"/>
+        <w:r>
+          <w:rPr>
+            <w:rStyle w:val="Hyperlink"/>
+          </w:rPr>
+          <w:t>SetUp</w:t>
+        </w:r>
+        <w:proofErr w:type="spellEnd"/>
+        <w:r>
+          <w:rPr>
+            <w:rStyle w:val="Hyperlink"/>
+          </w:rPr>
+          <w:t xml:space="preserve"> and </w:t>
+        </w:r>
+        <w:proofErr w:type="spellStart"/>
+        <w:r>
+          <w:rPr>
+            <w:rStyle w:val="Hyperlink"/>
+          </w:rPr>
+          <w:t>TearDown</w:t>
+        </w:r>
+        <w:proofErr w:type="spellEnd"/>
+        <w:r>
+          <w:rPr>
+            <w:rStyle w:val="Hyperlink"/>
+          </w:rPr>
+          <w:t xml:space="preserve"> | </w:t>
+        </w:r>
+        <w:proofErr w:type="spellStart"/>
+        <w:r>
+          <w:rPr>
+            <w:rStyle w:val="Hyperlink"/>
+          </w:rPr>
+          <w:t>NUnit</w:t>
+        </w:r>
+        <w:proofErr w:type="spellEnd"/>
+        <w:r>
+          <w:rPr>
+            <w:rStyle w:val="Hyperlink"/>
+          </w:rPr>
+          <w:t xml:space="preserve"> Docs</w:t>
+        </w:r>
+      </w:hyperlink>
+    </w:p>
+    <w:p>
+      <w:hyperlink r:id="rId52" w:history="1">
+        <w:proofErr w:type="spellStart"/>
+        <w:r>
+          <w:rPr>
+            <w:rStyle w:val="Hyperlink"/>
+          </w:rPr>
+          <w:t>TearDown</w:t>
+        </w:r>
+        <w:proofErr w:type="spellEnd"/>
+        <w:r>
+          <w:rPr>
+            <w:rStyle w:val="Hyperlink"/>
+          </w:rPr>
+          <w:t xml:space="preserve"> | </w:t>
+        </w:r>
+        <w:proofErr w:type="spellStart"/>
+        <w:r>
+          <w:rPr>
+            <w:rStyle w:val="Hyperlink"/>
+          </w:rPr>
+          <w:t>NUnit</w:t>
+        </w:r>
+        <w:proofErr w:type="spellEnd"/>
+        <w:r>
+          <w:rPr>
+            <w:rStyle w:val="Hyperlink"/>
+          </w:rPr>
+          <w:t xml:space="preserve"> Docs</w:t>
+        </w:r>
+      </w:hyperlink>
+    </w:p>
+    <w:p>
+      <w:hyperlink r:id="rId53" w:history="1">
+        <w:r>
+          <w:rPr>
+            <w:rStyle w:val="Hyperlink"/>
+          </w:rPr>
+          <w:t>spring - How do I reset my database state after each unit test without making the whole test a transaction? - Stack Overflow</w:t>
+        </w:r>
+      </w:hyperlink>
+    </w:p>
+    <w:p>
+      <w:hyperlink r:id="rId54" w:anchor="set-a-build-property" w:history="1">
+        <w:r>
+          <w:rPr>
+            <w:rStyle w:val="Hyperlink"/>
+          </w:rPr>
+          <w:t xml:space="preserve">Configure unit tests with </w:t>
+        </w:r>
+        <w:proofErr w:type="gramStart"/>
+        <w:r>
+          <w:rPr>
+            <w:rStyle w:val="Hyperlink"/>
+          </w:rPr>
+          <w:t>a .</w:t>
+        </w:r>
+        <w:proofErr w:type="spellStart"/>
+        <w:r>
+          <w:rPr>
+            <w:rStyle w:val="Hyperlink"/>
+          </w:rPr>
+          <w:t>runsettings</w:t>
+        </w:r>
+        <w:proofErr w:type="spellEnd"/>
+        <w:proofErr w:type="gramEnd"/>
+        <w:r>
+          <w:rPr>
+            <w:rStyle w:val="Hyperlink"/>
+          </w:rPr>
+          <w:t xml:space="preserve"> file - Visual Studio (Windows) | Microsoft Learn</w:t>
+        </w:r>
+      </w:hyperlink>
+    </w:p>
+    <w:p/>
     <w:p/>
     <w:p/>
     <w:p/>
@@ -3151,7 +3988,7 @@
                     <pic:cNvPicPr/>
                   </pic:nvPicPr>
                   <pic:blipFill>
-                    <a:blip r:embed="rId15"/>
+                    <a:blip r:embed="rId55"/>
                     <a:stretch>
                       <a:fillRect/>
                     </a:stretch>
@@ -3196,7 +4033,7 @@
                     <pic:cNvPicPr/>
                   </pic:nvPicPr>
                   <pic:blipFill>
-                    <a:blip r:embed="rId16"/>
+                    <a:blip r:embed="rId56"/>
                     <a:stretch>
                       <a:fillRect/>
                     </a:stretch>
@@ -11752,7 +12589,7 @@
                     <pic:cNvPicPr/>
                   </pic:nvPicPr>
                   <pic:blipFill>
-                    <a:blip r:embed="rId17"/>
+                    <a:blip r:embed="rId57"/>
                     <a:stretch>
                       <a:fillRect/>
                     </a:stretch>
@@ -11795,7 +12632,7 @@
                     <pic:cNvPicPr/>
                   </pic:nvPicPr>
                   <pic:blipFill>
-                    <a:blip r:embed="rId18"/>
+                    <a:blip r:embed="rId58"/>
                     <a:stretch>
                       <a:fillRect/>
                     </a:stretch>

</xml_diff>